<commit_message>
Updated report to accurately reflect how builder is used in the system
</commit_message>
<xml_diff>
--- a/docs/TIVIDY_Practical6_Report.docx
+++ b/docs/TIVIDY_Practical6_Report.docx
@@ -8,17 +8,16 @@
         <w:keepNext/>
       </w:pPr>
       <w:r>
-        <w:rPr/>
-        <w:t xml:space="preserve">Group Member Details</w:t>
+        <w:t>Group Member Details</w:t>
       </w:r>
     </w:p>
     <w:p>
       <w:pPr>
+        <w:spacing w:after="100" w:line="252" w:lineRule="auto"/>
         <w:rPr>
           <w:sz w:val="19"/>
           <w:szCs w:val="19"/>
         </w:rPr>
-        <w:spacing w:after="100" w:line="252" w:lineRule="auto"/>
       </w:pPr>
       <w:r>
         <w:rPr>
@@ -30,11 +29,11 @@
     </w:p>
     <w:p>
       <w:pPr>
+        <w:spacing w:after="100" w:line="252" w:lineRule="auto"/>
         <w:rPr>
           <w:sz w:val="19"/>
           <w:szCs w:val="19"/>
         </w:rPr>
-        <w:spacing w:after="100" w:line="252" w:lineRule="auto"/>
       </w:pPr>
       <w:r>
         <w:rPr>
@@ -46,11 +45,11 @@
     </w:p>
     <w:p>
       <w:pPr>
+        <w:spacing w:after="100" w:line="252" w:lineRule="auto"/>
         <w:rPr>
           <w:sz w:val="19"/>
           <w:szCs w:val="19"/>
         </w:rPr>
-        <w:spacing w:after="100" w:line="252" w:lineRule="auto"/>
       </w:pPr>
       <w:r>
         <w:rPr>
@@ -62,11 +61,11 @@
     </w:p>
     <w:p>
       <w:pPr>
+        <w:spacing w:after="100" w:line="252" w:lineRule="auto"/>
         <w:rPr>
           <w:sz w:val="19"/>
           <w:szCs w:val="19"/>
         </w:rPr>
-        <w:spacing w:after="100" w:line="252" w:lineRule="auto"/>
       </w:pPr>
       <w:r>
         <w:rPr>
@@ -78,11 +77,11 @@
     </w:p>
     <w:p>
       <w:pPr>
+        <w:spacing w:after="100" w:line="252" w:lineRule="auto"/>
         <w:rPr>
           <w:sz w:val="19"/>
           <w:szCs w:val="19"/>
         </w:rPr>
-        <w:spacing w:after="100" w:line="252" w:lineRule="auto"/>
       </w:pPr>
       <w:r>
         <w:rPr>
@@ -94,48 +93,36 @@
     </w:p>
     <w:p>
       <w:pPr>
+        <w:spacing w:after="100" w:line="252" w:lineRule="auto"/>
         <w:rPr>
           <w:sz w:val="19"/>
           <w:szCs w:val="19"/>
+          <w:lang w:val="nb-NO"/>
         </w:rPr>
-        <w:spacing w:after="100" w:line="252" w:lineRule="auto"/>
       </w:pPr>
       <w:r>
         <w:rPr>
           <w:sz w:val="19"/>
           <w:szCs w:val="19"/>
+          <w:lang w:val="nb-NO"/>
         </w:rPr>
-        <w:t xml:space="preserve">Angela </w:t>
-      </w:r>
-      <w:proofErr w:type="spellStart"/>
-      <w:r>
-        <w:rPr>
-          <w:sz w:val="19"/>
-          <w:szCs w:val="19"/>
-        </w:rPr>
-        <w:t>Ramaboea</w:t>
-      </w:r>
-      <w:proofErr w:type="spellEnd"/>
-      <w:r>
-        <w:rPr>
-          <w:sz w:val="19"/>
-          <w:szCs w:val="19"/>
-        </w:rPr>
-        <w:t xml:space="preserve"> u25445392</w:t>
+        <w:t>Angela Ramaboea u25445392</w:t>
       </w:r>
     </w:p>
     <w:p>
       <w:pPr>
+        <w:spacing w:after="100" w:line="252" w:lineRule="auto"/>
         <w:rPr>
           <w:sz w:val="19"/>
           <w:szCs w:val="19"/>
+          <w:lang w:val="nb-NO"/>
         </w:rPr>
-        <w:spacing w:after="100" w:line="252" w:lineRule="auto"/>
       </w:pPr>
       <w:r>
         <w:rPr>
           <w:sz w:val="19"/>
           <w:szCs w:val="19"/>
+          <w:lang w:val="nb-NO"/>
         </w:rPr>
         <w:t>Tebogo Mokgwatsane u25042239</w:t>
       </w:r>
@@ -143,10 +130,10 @@
     <w:p>
       <w:pPr>
         <w:pStyle w:val="Heading1"/>
+        <w:keepNext/>
         <w:pBdr>
           <w:bottom w:val="single" w:sz="8" w:space="2" w:color="1F3864"/>
         </w:pBdr>
-        <w:keepNext/>
       </w:pPr>
       <w:r>
         <w:t>Task 1: Research Findings on Workflow Management Systems</w:t>
@@ -375,23 +362,7 @@
           <w:sz w:val="19"/>
           <w:szCs w:val="19"/>
         </w:rPr>
-        <w:t xml:space="preserve"> Engines do not hard-code applications. They invoke them through an invoked-application interface or application </w:t>
-      </w:r>
-      <w:proofErr w:type="gramStart"/>
-      <w:r>
-        <w:rPr>
-          <w:sz w:val="19"/>
-          <w:szCs w:val="19"/>
-        </w:rPr>
-        <w:t>agents, and</w:t>
-      </w:r>
-      <w:proofErr w:type="gramEnd"/>
-      <w:r>
-        <w:rPr>
-          <w:sz w:val="19"/>
-          <w:szCs w:val="19"/>
-        </w:rPr>
-        <w:t xml:space="preserve"> reach other engines through gateways that map names and data [1].</w:t>
+        <w:t xml:space="preserve"> Engines do not hard-code applications. They invoke them through an invoked-application interface or application agents, and reach other engines through gateways that map names and data [1].</w:t>
       </w:r>
     </w:p>
     <w:p>
@@ -931,6 +902,7 @@
                 <w:sz w:val="18"/>
                 <w:szCs w:val="18"/>
               </w:rPr>
+              <w:lastRenderedPageBreak/>
               <w:t>External systems, participants</w:t>
             </w:r>
           </w:p>
@@ -1200,6 +1172,7 @@
           <w:bCs/>
           <w:sz w:val="18"/>
           <w:szCs w:val="18"/>
+          <w:lang w:val="nb-NO"/>
         </w:rPr>
         <w:t>[3]</w:t>
       </w:r>
@@ -1209,6 +1182,7 @@
           <w:bCs/>
           <w:sz w:val="18"/>
           <w:szCs w:val="18"/>
+          <w:lang w:val="nb-NO"/>
         </w:rPr>
         <w:tab/>
       </w:r>
@@ -1216,8 +1190,16 @@
         <w:rPr>
           <w:sz w:val="18"/>
           <w:szCs w:val="18"/>
+          <w:lang w:val="nb-NO"/>
         </w:rPr>
-        <w:t xml:space="preserve">Russell, N., van der Aalst, W.M.P., ter Hofstede, A.H.M., &amp; Edmond, D. (2005). Workflow Resource Patterns: Identification, Representation and Tool Support. In </w:t>
+        <w:t xml:space="preserve">Russell, N., van der Aalst, W.M.P., ter Hofstede, A.H.M., &amp; Edmond, D. (2005). </w:t>
+      </w:r>
+      <w:r>
+        <w:rPr>
+          <w:sz w:val="18"/>
+          <w:szCs w:val="18"/>
+        </w:rPr>
+        <w:t xml:space="preserve">Workflow Resource Patterns: Identification, Representation and Tool Support. In </w:t>
       </w:r>
       <w:proofErr w:type="spellStart"/>
       <w:r>
@@ -1450,11 +1432,11 @@
     <w:p>
       <w:pPr>
         <w:pStyle w:val="Heading1"/>
+        <w:keepNext/>
         <w:pageBreakBefore/>
         <w:pBdr>
           <w:bottom w:val="single" w:sz="8" w:space="0" w:color="1F3864"/>
         </w:pBdr>
-        <w:keepNext/>
       </w:pPr>
       <w:r>
         <w:t>Task 2: Define the Scenario and System</w:t>
@@ -1466,8 +1448,7 @@
         <w:keepNext/>
       </w:pPr>
       <w:r>
-        <w:rPr/>
-        <w:t xml:space="preserve">2.1  Selected Scenario: Faculty Admissions and Bursary Processing</w:t>
+        <w:t>2.1  Selected Scenario: Faculty Admissions and Bursary Processing</w:t>
       </w:r>
     </w:p>
     <w:p>
@@ -1484,11 +1465,11 @@
     </w:p>
     <w:p>
       <w:pPr>
+        <w:spacing w:after="100" w:line="252" w:lineRule="auto"/>
         <w:rPr>
           <w:b/>
           <w:bCs/>
         </w:rPr>
-        <w:spacing w:after="100" w:line="252" w:lineRule="auto"/>
       </w:pPr>
       <w:r>
         <w:rPr>
@@ -1521,8 +1502,8 @@
     <w:p>
       <w:pPr>
         <w:pStyle w:val="ListParagraph"/>
+        <w:spacing w:after="100" w:line="252" w:lineRule="auto"/>
         <w:ind w:left="720"/>
-        <w:spacing w:after="100" w:line="252" w:lineRule="auto"/>
       </w:pPr>
       <w:r>
         <w:rPr>
@@ -1553,8 +1534,8 @@
     <w:p>
       <w:pPr>
         <w:pStyle w:val="ListParagraph"/>
+        <w:spacing w:after="100" w:line="252" w:lineRule="auto"/>
         <w:ind w:left="720"/>
-        <w:spacing w:after="100" w:line="252" w:lineRule="auto"/>
       </w:pPr>
       <w:r>
         <w:rPr>
@@ -1585,8 +1566,8 @@
     <w:p>
       <w:pPr>
         <w:pStyle w:val="ListParagraph"/>
+        <w:spacing w:after="100" w:line="252" w:lineRule="auto"/>
         <w:ind w:left="720"/>
-        <w:spacing w:after="100" w:line="252" w:lineRule="auto"/>
       </w:pPr>
       <w:r>
         <w:rPr>
@@ -1617,8 +1598,8 @@
     <w:p>
       <w:pPr>
         <w:pStyle w:val="ListParagraph"/>
+        <w:spacing w:after="100" w:line="252" w:lineRule="auto"/>
         <w:ind w:left="720"/>
-        <w:spacing w:after="100" w:line="252" w:lineRule="auto"/>
       </w:pPr>
       <w:r>
         <w:rPr>
@@ -1649,8 +1630,8 @@
     <w:p>
       <w:pPr>
         <w:pStyle w:val="ListParagraph"/>
+        <w:spacing w:after="100" w:line="252" w:lineRule="auto"/>
         <w:ind w:left="720"/>
-        <w:spacing w:after="100" w:line="252" w:lineRule="auto"/>
       </w:pPr>
       <w:r>
         <w:rPr>
@@ -1699,8 +1680,8 @@
     <w:p>
       <w:pPr>
         <w:pStyle w:val="ListParagraph"/>
+        <w:spacing w:after="100" w:line="252" w:lineRule="auto"/>
         <w:ind w:left="720"/>
-        <w:spacing w:after="100" w:line="252" w:lineRule="auto"/>
       </w:pPr>
       <w:r>
         <w:rPr>
@@ -1716,8 +1697,7 @@
         <w:keepNext/>
       </w:pPr>
       <w:r>
-        <w:rPr/>
-        <w:t xml:space="preserve">2.2  Initial TIVIDY System Scope and Design Rationale</w:t>
+        <w:t>2.2  Initial TIVIDY System Scope and Design Rationale</w:t>
       </w:r>
     </w:p>
     <w:p>
@@ -1734,11 +1714,10 @@
     </w:p>
     <w:p>
       <w:pPr>
-        <w:pStyle w:val="Normal"/>
+        <w:spacing w:after="100" w:line="252" w:lineRule="auto"/>
         <w:rPr>
           <w:rStyle w:val="BookTitle"/>
         </w:rPr>
-        <w:spacing w:after="100" w:line="252" w:lineRule="auto"/>
       </w:pPr>
       <w:r>
         <w:rPr>
@@ -1746,7 +1725,7 @@
           <w:sz w:val="19"/>
           <w:szCs w:val="19"/>
         </w:rPr>
-        <w:t xml:space="preserve">Layer 1: Generic Engine Core</w:t>
+        <w:t>Layer 1: Generic Engine Core</w:t>
       </w:r>
     </w:p>
     <w:p>
@@ -1763,11 +1742,10 @@
     </w:p>
     <w:p>
       <w:pPr>
-        <w:pStyle w:val="Normal"/>
+        <w:spacing w:after="100" w:line="252" w:lineRule="auto"/>
         <w:rPr>
           <w:rStyle w:val="BookTitle"/>
         </w:rPr>
-        <w:spacing w:after="100" w:line="252" w:lineRule="auto"/>
       </w:pPr>
       <w:r>
         <w:rPr>
@@ -1775,7 +1753,7 @@
           <w:sz w:val="19"/>
           <w:szCs w:val="19"/>
         </w:rPr>
-        <w:t xml:space="preserve">Layer 2: Scenario Plug-in</w:t>
+        <w:t>Layer 2: Scenario Plug-in</w:t>
       </w:r>
     </w:p>
     <w:p>
@@ -1793,12 +1771,11 @@
     <w:p>
       <w:pPr>
         <w:pStyle w:val="Heading1"/>
+        <w:keepNext/>
         <w:pageBreakBefore/>
-        <w:keepNext/>
       </w:pPr>
       <w:r>
-        <w:rPr/>
-        <w:t xml:space="preserve">Task 3: UML Activity Diagrams</w:t>
+        <w:t>Task 3: UML Activity Diagrams</w:t>
       </w:r>
     </w:p>
     <w:p>
@@ -1831,7 +1808,7 @@
                         </pic:cNvPicPr>
                       </pic:nvPicPr>
                       <pic:blipFill rotWithShape="1">
-                        <a:blip r:embed="rId17"/>
+                        <a:blip r:embed="rId13"/>
                         <a:stretch/>
                       </pic:blipFill>
                       <pic:spPr bwMode="auto">
@@ -1881,8 +1858,8 @@
     </w:p>
     <w:p>
       <w:pPr>
+        <w:spacing w:before="60" w:after="240"/>
         <w:jc w:val="center"/>
-        <w:spacing w:before="60" w:after="240"/>
       </w:pPr>
       <w:r>
         <w:rPr>
@@ -1891,7 +1868,7 @@
           <w:sz w:val="18"/>
           <w:szCs w:val="18"/>
         </w:rPr>
-        <w:t xml:space="preserve">Activity Diagram 1: Generic workflow execution, from instance creation to completion</w:t>
+        <w:t>Activity Diagram 1: Generic workflow execution, from instance creation to completion</w:t>
       </w:r>
     </w:p>
     <w:p>
@@ -1975,8 +1952,8 @@
     </w:p>
     <w:p>
       <w:pPr>
+        <w:spacing w:before="60" w:after="240"/>
         <w:jc w:val="center"/>
-        <w:spacing w:before="60" w:after="240"/>
       </w:pPr>
       <w:r>
         <w:rPr>
@@ -1985,7 +1962,7 @@
           <w:sz w:val="18"/>
           <w:szCs w:val="18"/>
         </w:rPr>
-        <w:t xml:space="preserve">Activity Diagram 2: Approval and escalation</w:t>
+        <w:t>Activity Diagram 2: Approval and escalation</w:t>
       </w:r>
     </w:p>
     <w:p>
@@ -2069,8 +2046,8 @@
     </w:p>
     <w:p>
       <w:pPr>
+        <w:spacing w:before="60" w:after="240"/>
         <w:jc w:val="center"/>
-        <w:spacing w:before="60" w:after="240"/>
       </w:pPr>
       <w:r>
         <w:rPr>
@@ -2079,17 +2056,17 @@
           <w:sz w:val="18"/>
           <w:szCs w:val="18"/>
         </w:rPr>
-        <w:t xml:space="preserve">Activity Diagram 3: Scenario workflow (University Admissions and Bursary Processing)</w:t>
+        <w:t>Activity Diagram 3: Scenario workflow (University Admissions and Bursary Processing)</w:t>
       </w:r>
     </w:p>
     <w:p>
       <w:pPr>
         <w:pStyle w:val="Heading1"/>
+        <w:keepNext/>
         <w:pageBreakBefore/>
         <w:pBdr>
           <w:bottom w:val="single" w:sz="8" w:space="2" w:color="1F3864"/>
         </w:pBdr>
-        <w:keepNext/>
       </w:pPr>
       <w:r>
         <w:t>Task 4: Design Patterns</w:t>
@@ -3704,10 +3681,10 @@
           <w:tcPr>
             <w:tcW w:w="450" w:type="dxa"/>
             <w:tcBorders>
-              <w:top w:val="single" w:color="BFBFBF" w:sz="4" w:space="0"/>
-              <w:left w:val="single" w:color="BFBFBF" w:sz="4" w:space="0"/>
-              <w:bottom w:val="single" w:color="BFBFBF" w:sz="4" w:space="0"/>
-              <w:right w:val="single" w:color="BFBFBF" w:sz="4" w:space="0"/>
+              <w:top w:val="single" w:sz="4" w:space="0" w:color="BFBFBF"/>
+              <w:left w:val="single" w:sz="4" w:space="0" w:color="BFBFBF"/>
+              <w:bottom w:val="single" w:sz="4" w:space="0" w:color="BFBFBF"/>
+              <w:right w:val="single" w:sz="4" w:space="0" w:color="BFBFBF"/>
             </w:tcBorders>
             <w:tcMar>
               <w:top w:w="60" w:type="dxa"/>
@@ -3733,10 +3710,10 @@
           <w:tcPr>
             <w:tcW w:w="1900" w:type="dxa"/>
             <w:tcBorders>
-              <w:top w:val="single" w:color="BFBFBF" w:sz="4" w:space="0"/>
-              <w:left w:val="single" w:color="BFBFBF" w:sz="4" w:space="0"/>
-              <w:bottom w:val="single" w:color="BFBFBF" w:sz="4" w:space="0"/>
-              <w:right w:val="single" w:color="BFBFBF" w:sz="4" w:space="0"/>
+              <w:top w:val="single" w:sz="4" w:space="0" w:color="BFBFBF"/>
+              <w:left w:val="single" w:sz="4" w:space="0" w:color="BFBFBF"/>
+              <w:bottom w:val="single" w:sz="4" w:space="0" w:color="BFBFBF"/>
+              <w:right w:val="single" w:sz="4" w:space="0" w:color="BFBFBF"/>
             </w:tcBorders>
             <w:tcMar>
               <w:top w:w="60" w:type="dxa"/>
@@ -3763,10 +3740,10 @@
           <w:tcPr>
             <w:tcW w:w="1300" w:type="dxa"/>
             <w:tcBorders>
-              <w:top w:val="single" w:color="BFBFBF" w:sz="4" w:space="0"/>
-              <w:left w:val="single" w:color="BFBFBF" w:sz="4" w:space="0"/>
-              <w:bottom w:val="single" w:color="BFBFBF" w:sz="4" w:space="0"/>
-              <w:right w:val="single" w:color="BFBFBF" w:sz="4" w:space="0"/>
+              <w:top w:val="single" w:sz="4" w:space="0" w:color="BFBFBF"/>
+              <w:left w:val="single" w:sz="4" w:space="0" w:color="BFBFBF"/>
+              <w:bottom w:val="single" w:sz="4" w:space="0" w:color="BFBFBF"/>
+              <w:right w:val="single" w:sz="4" w:space="0" w:color="BFBFBF"/>
             </w:tcBorders>
             <w:tcMar>
               <w:top w:w="60" w:type="dxa"/>
@@ -3792,10 +3769,10 @@
           <w:tcPr>
             <w:tcW w:w="5988" w:type="dxa"/>
             <w:tcBorders>
-              <w:top w:val="single" w:color="BFBFBF" w:sz="4" w:space="0"/>
-              <w:left w:val="single" w:color="BFBFBF" w:sz="4" w:space="0"/>
-              <w:bottom w:val="single" w:color="BFBFBF" w:sz="4" w:space="0"/>
-              <w:right w:val="single" w:color="BFBFBF" w:sz="4" w:space="0"/>
+              <w:top w:val="single" w:sz="4" w:space="0" w:color="BFBFBF"/>
+              <w:left w:val="single" w:sz="4" w:space="0" w:color="BFBFBF"/>
+              <w:bottom w:val="single" w:sz="4" w:space="0" w:color="BFBFBF"/>
+              <w:right w:val="single" w:sz="4" w:space="0" w:color="BFBFBF"/>
             </w:tcBorders>
             <w:tcMar>
               <w:top w:w="60" w:type="dxa"/>
@@ -3824,13 +3801,8 @@
         <w:pStyle w:val="Heading2"/>
         <w:keepNext/>
       </w:pPr>
-      <w:proofErr w:type="gramStart"/>
       <w:r>
-        <w:t>4.1  Builder</w:t>
-      </w:r>
-      <w:proofErr w:type="gramEnd"/>
-      <w:r>
-        <w:t xml:space="preserve"> (Creational)</w:t>
+        <w:t>4.1  Builder (Creational)</w:t>
       </w:r>
     </w:p>
     <w:tbl>
@@ -4022,41 +3994,80 @@
           <w:p>
             <w:pPr>
               <w:spacing w:after="30" w:line="245" w:lineRule="auto"/>
-            </w:pPr>
+              <w:rPr>
+                <w:sz w:val="19"/>
+                <w:szCs w:val="19"/>
+              </w:rPr>
+            </w:pPr>
+            <w:proofErr w:type="spellStart"/>
             <w:r>
               <w:rPr>
                 <w:b/>
                 <w:sz w:val="19"/>
                 <w:szCs w:val="19"/>
               </w:rPr>
-              <w:t>ConcreteBuilder:</w:t>
-            </w:r>
-            <w:r>
-              <w:rPr>
-                <w:sz w:val="19"/>
-                <w:szCs w:val="19"/>
-              </w:rPr>
-              <w:t xml:space="preserve"> one per process, supplied as configuration outside the engine</w:t>
-            </w:r>
-          </w:p>
-          <w:p>
-            <w:pPr>
-              <w:spacing w:after="30" w:line="245" w:lineRule="auto"/>
-            </w:pPr>
+              <w:t>ConcreteBuilder</w:t>
+            </w:r>
+            <w:proofErr w:type="spellEnd"/>
             <w:r>
               <w:rPr>
                 <w:b/>
                 <w:sz w:val="19"/>
                 <w:szCs w:val="19"/>
               </w:rPr>
-              <w:t>Product:</w:t>
+              <w:t>:</w:t>
             </w:r>
             <w:r>
               <w:rPr>
                 <w:sz w:val="19"/>
                 <w:szCs w:val="19"/>
               </w:rPr>
-              <w:t xml:space="preserve"> WorkflowDefinition (versioned)</w:t>
+              <w:t xml:space="preserve"> </w:t>
+            </w:r>
+            <w:proofErr w:type="spellStart"/>
+            <w:r>
+              <w:rPr>
+                <w:sz w:val="19"/>
+                <w:szCs w:val="19"/>
+              </w:rPr>
+              <w:t>FileWorkflowDefinitionBuilder</w:t>
+            </w:r>
+            <w:proofErr w:type="spellEnd"/>
+          </w:p>
+          <w:p>
+            <w:pPr>
+              <w:spacing w:after="30" w:line="245" w:lineRule="auto"/>
+            </w:pPr>
+            <w:r>
+              <w:rPr>
+                <w:b/>
+                <w:sz w:val="19"/>
+                <w:szCs w:val="19"/>
+              </w:rPr>
+              <w:t>Product:</w:t>
+            </w:r>
+            <w:r>
+              <w:rPr>
+                <w:sz w:val="19"/>
+                <w:szCs w:val="19"/>
+              </w:rPr>
+              <w:t xml:space="preserve"> </w:t>
+            </w:r>
+            <w:proofErr w:type="spellStart"/>
+            <w:r>
+              <w:rPr>
+                <w:sz w:val="19"/>
+                <w:szCs w:val="19"/>
+              </w:rPr>
+              <w:t>WorkflowDefinition</w:t>
+            </w:r>
+            <w:proofErr w:type="spellEnd"/>
+            <w:r>
+              <w:rPr>
+                <w:sz w:val="19"/>
+                <w:szCs w:val="19"/>
+              </w:rPr>
+              <w:t xml:space="preserve"> (versioned)</w:t>
             </w:r>
           </w:p>
         </w:tc>
@@ -4200,7 +4211,14 @@
                 <w:sz w:val="19"/>
                 <w:szCs w:val="19"/>
               </w:rPr>
-              <w:t>Which process is being defined. A new process is a new ConcreteBuilder; the Director, engine and product classes stay unchanged.</w:t>
+              <w:t xml:space="preserve">Which process is being defined. A new process is a new </w:t>
+            </w:r>
+            <w:r>
+              <w:rPr>
+                <w:sz w:val="19"/>
+                <w:szCs w:val="19"/>
+              </w:rPr>
+              <w:t>file that is read by the builder who creates the definition based on the specifications in the file. All the participating classes remain unchanged. New concrete builders that builders the definition based on another type of payload can easily be added in the future.</w:t>
             </w:r>
           </w:p>
         </w:tc>
@@ -4331,7 +4349,14 @@
                 <w:sz w:val="19"/>
                 <w:szCs w:val="19"/>
               </w:rPr>
-              <w:t>AdmissionsWorkflowBuilder builds the intake, academic review, bursary and enrolment sub-processes.</w:t>
+              <w:t>A txt file for the university applications workflow is supplied to the builder, the builder reads the files and builds the structure, adds routing, dependencies, decorators and much on how the workflow.</w:t>
+            </w:r>
+            <w:r>
+              <w:rPr>
+                <w:sz w:val="19"/>
+                <w:szCs w:val="19"/>
+              </w:rPr>
+              <w:t xml:space="preserve"> </w:t>
             </w:r>
           </w:p>
         </w:tc>
@@ -4342,13 +4367,8 @@
         <w:pStyle w:val="Heading2"/>
         <w:keepNext/>
       </w:pPr>
-      <w:proofErr w:type="gramStart"/>
       <w:r>
-        <w:t>4.2  Composite</w:t>
-      </w:r>
-      <w:proofErr w:type="gramEnd"/>
-      <w:r>
-        <w:t xml:space="preserve"> (Structural)</w:t>
+        <w:t>4.2  Composite (Structural)</w:t>
       </w:r>
     </w:p>
     <w:tbl>
@@ -4828,13 +4848,8 @@
         <w:pStyle w:val="Heading2"/>
         <w:keepNext/>
       </w:pPr>
-      <w:proofErr w:type="gramStart"/>
       <w:r>
-        <w:t>4.3  State</w:t>
-      </w:r>
-      <w:proofErr w:type="gramEnd"/>
-      <w:r>
-        <w:t xml:space="preserve"> (Behavioural)</w:t>
+        <w:t>4.3  State (Behavioural)</w:t>
       </w:r>
     </w:p>
     <w:tbl>
@@ -5314,13 +5329,8 @@
         <w:pStyle w:val="Heading2"/>
         <w:keepNext/>
       </w:pPr>
-      <w:proofErr w:type="gramStart"/>
       <w:r>
-        <w:t>4.4  Strategy</w:t>
-      </w:r>
-      <w:proofErr w:type="gramEnd"/>
-      <w:r>
-        <w:t xml:space="preserve"> (Behavioural)</w:t>
+        <w:t>4.4  Strategy (Behavioural)</w:t>
       </w:r>
     </w:p>
     <w:tbl>
@@ -5800,13 +5810,8 @@
         <w:pStyle w:val="Heading2"/>
         <w:keepNext/>
       </w:pPr>
-      <w:proofErr w:type="gramStart"/>
       <w:r>
-        <w:t>4.5  Chain</w:t>
-      </w:r>
-      <w:proofErr w:type="gramEnd"/>
-      <w:r>
-        <w:t xml:space="preserve"> of Responsibility (Behavioural)</w:t>
+        <w:t>4.5  Chain of Responsibility (Behavioural)</w:t>
       </w:r>
     </w:p>
     <w:tbl>
@@ -6266,13 +6271,8 @@
         <w:pStyle w:val="Heading2"/>
         <w:keepNext/>
       </w:pPr>
-      <w:proofErr w:type="gramStart"/>
       <w:r>
-        <w:t>4.6  Command</w:t>
-      </w:r>
-      <w:proofErr w:type="gramEnd"/>
-      <w:r>
-        <w:t xml:space="preserve"> (Behavioural)</w:t>
+        <w:t>4.6  Command (Behavioural)</w:t>
       </w:r>
     </w:p>
     <w:tbl>
@@ -6792,13 +6792,8 @@
         <w:pStyle w:val="Heading2"/>
         <w:keepNext/>
       </w:pPr>
-      <w:proofErr w:type="gramStart"/>
       <w:r>
-        <w:t>4.7  Memento</w:t>
-      </w:r>
-      <w:proofErr w:type="gramEnd"/>
-      <w:r>
-        <w:t xml:space="preserve"> (Behavioural)</w:t>
+        <w:t>4.7  Memento (Behavioural)</w:t>
       </w:r>
     </w:p>
     <w:tbl>
@@ -7278,13 +7273,8 @@
         <w:pStyle w:val="Heading2"/>
         <w:keepNext/>
       </w:pPr>
-      <w:proofErr w:type="gramStart"/>
       <w:r>
-        <w:t>4.8  Observer</w:t>
-      </w:r>
-      <w:proofErr w:type="gramEnd"/>
-      <w:r>
-        <w:t xml:space="preserve"> (Behavioural)</w:t>
+        <w:t>4.8  Observer (Behavioural)</w:t>
       </w:r>
     </w:p>
     <w:tbl>
@@ -7445,12 +7435,6 @@
               </w:rPr>
               <w:t>Subject: EventDispatcher (the Singleton of 4.13); each WorkItem publishes its events through it</w:t>
             </w:r>
-            <w:r>
-              <w:rPr>
-                <w:sz w:val="19"/>
-                <w:szCs w:val="19"/>
-              </w:rPr>
-            </w:r>
           </w:p>
           <w:p>
             <w:pPr>
@@ -7783,13 +7767,8 @@
         <w:pStyle w:val="Heading2"/>
         <w:keepNext/>
       </w:pPr>
-      <w:proofErr w:type="gramStart"/>
       <w:r>
-        <w:t>4.9  Decorator</w:t>
-      </w:r>
-      <w:proofErr w:type="gramEnd"/>
-      <w:r>
-        <w:t xml:space="preserve"> (Structural)</w:t>
+        <w:t>4.9  Decorator (Structural)</w:t>
       </w:r>
     </w:p>
     <w:tbl>
@@ -8269,13 +8248,8 @@
         <w:pStyle w:val="Heading2"/>
         <w:keepNext/>
       </w:pPr>
-      <w:proofErr w:type="gramStart"/>
       <w:r>
-        <w:t>4.10  Adapter</w:t>
-      </w:r>
-      <w:proofErr w:type="gramEnd"/>
-      <w:r>
-        <w:t xml:space="preserve"> (Structural)</w:t>
+        <w:t>4.10  Adapter (Structural)</w:t>
       </w:r>
     </w:p>
     <w:tbl>
@@ -8775,13 +8749,8 @@
         <w:pStyle w:val="Heading2"/>
         <w:keepNext/>
       </w:pPr>
-      <w:proofErr w:type="gramStart"/>
       <w:r>
-        <w:t>4.11  Mediator</w:t>
-      </w:r>
-      <w:proofErr w:type="gramEnd"/>
-      <w:r>
-        <w:t xml:space="preserve"> (Behavioural)</w:t>
+        <w:t>4.11  Mediator (Behavioural)</w:t>
       </w:r>
     </w:p>
     <w:tbl>
@@ -9261,13 +9230,8 @@
         <w:pStyle w:val="Heading2"/>
         <w:keepNext/>
       </w:pPr>
-      <w:proofErr w:type="gramStart"/>
       <w:r>
-        <w:t>4.12  Facade</w:t>
-      </w:r>
-      <w:proofErr w:type="gramEnd"/>
-      <w:r>
-        <w:t xml:space="preserve"> (Structural)</w:t>
+        <w:t>4.12  Facade (Structural)</w:t>
       </w:r>
     </w:p>
     <w:tbl>
@@ -9728,24 +9692,21 @@
         <w:keepNext/>
       </w:pPr>
       <w:r>
-        <w:t xml:space="preserve">4.13  </w:t>
-      </w:r>
-      <w:r>
-        <w:t>Singleton (Creational)</w:t>
+        <w:t>4.13  Singleton (Creational)</w:t>
       </w:r>
     </w:p>
     <w:tbl>
       <w:tblPr>
         <w:tblW w:w="9638" w:type="dxa"/>
         <w:tblBorders>
-          <w:top w:val="single" w:color="auto" w:sz="4" w:space="0"/>
-          <w:left w:val="single" w:color="auto" w:sz="4" w:space="0"/>
-          <w:bottom w:val="single" w:color="auto" w:sz="4" w:space="0"/>
-          <w:right w:val="single" w:color="auto" w:sz="4" w:space="0"/>
-          <w:insideH w:val="single" w:color="auto" w:sz="4" w:space="0"/>
-          <w:insideV w:val="single" w:color="auto" w:sz="4" w:space="0"/>
+          <w:top w:val="single" w:sz="4" w:space="0" w:color="auto"/>
+          <w:left w:val="single" w:sz="4" w:space="0" w:color="auto"/>
+          <w:bottom w:val="single" w:sz="4" w:space="0" w:color="auto"/>
+          <w:right w:val="single" w:sz="4" w:space="0" w:color="auto"/>
+          <w:insideH w:val="single" w:sz="4" w:space="0" w:color="auto"/>
+          <w:insideV w:val="single" w:sz="4" w:space="0" w:color="auto"/>
         </w:tblBorders>
-        <w:tblLook w:firstColumn="1" w:firstRow="1" w:lastColumn="0" w:lastRow="0" w:noHBand="0" w:noVBand="1" w:val="04A0"/>
+        <w:tblLook w:val="04A0" w:firstRow="1" w:lastRow="0" w:firstColumn="1" w:lastColumn="0" w:noHBand="0" w:noVBand="1"/>
       </w:tblPr>
       <w:tblGrid>
         <w:gridCol w:w="1750"/>
@@ -9754,18 +9715,17 @@
       <w:tr>
         <w:trPr>
           <w:cantSplit/>
-          <w:hidden w:val="0"/>
         </w:trPr>
         <w:tc>
           <w:tcPr>
             <w:tcW w:w="1750" w:type="dxa"/>
             <w:tcBorders>
-              <w:top w:val="single" w:color="BFBFBF" w:sz="4" w:space="0"/>
-              <w:left w:val="single" w:color="BFBFBF" w:sz="4" w:space="0"/>
-              <w:bottom w:val="single" w:color="BFBFBF" w:sz="4" w:space="0"/>
-              <w:right w:val="single" w:color="BFBFBF" w:sz="4" w:space="0"/>
+              <w:top w:val="single" w:sz="4" w:space="0" w:color="BFBFBF"/>
+              <w:left w:val="single" w:sz="4" w:space="0" w:color="BFBFBF"/>
+              <w:bottom w:val="single" w:sz="4" w:space="0" w:color="BFBFBF"/>
+              <w:right w:val="single" w:sz="4" w:space="0" w:color="BFBFBF"/>
             </w:tcBorders>
-            <w:shd w:color="auto" w:fill="F2F2F2" w:val="clear"/>
+            <w:shd w:val="clear" w:color="auto" w:fill="F2F2F2"/>
             <w:tcMar>
               <w:top w:w="60" w:type="dxa"/>
               <w:left w:w="100" w:type="dxa"/>
@@ -9792,10 +9752,10 @@
           <w:tcPr>
             <w:tcW w:w="7888" w:type="dxa"/>
             <w:tcBorders>
-              <w:top w:val="single" w:color="BFBFBF" w:sz="4" w:space="0"/>
-              <w:left w:val="single" w:color="BFBFBF" w:sz="4" w:space="0"/>
-              <w:bottom w:val="single" w:color="BFBFBF" w:sz="4" w:space="0"/>
-              <w:right w:val="single" w:color="BFBFBF" w:sz="4" w:space="0"/>
+              <w:top w:val="single" w:sz="4" w:space="0" w:color="BFBFBF"/>
+              <w:left w:val="single" w:sz="4" w:space="0" w:color="BFBFBF"/>
+              <w:bottom w:val="single" w:sz="4" w:space="0" w:color="BFBFBF"/>
+              <w:right w:val="single" w:sz="4" w:space="0" w:color="BFBFBF"/>
             </w:tcBorders>
             <w:tcMar>
               <w:top w:w="60" w:type="dxa"/>
@@ -9821,18 +9781,17 @@
       <w:tr>
         <w:trPr>
           <w:cantSplit/>
-          <w:hidden w:val="0"/>
         </w:trPr>
         <w:tc>
           <w:tcPr>
             <w:tcW w:w="1750" w:type="dxa"/>
             <w:tcBorders>
-              <w:top w:val="single" w:color="BFBFBF" w:sz="4" w:space="0"/>
-              <w:left w:val="single" w:color="BFBFBF" w:sz="4" w:space="0"/>
-              <w:bottom w:val="single" w:color="BFBFBF" w:sz="4" w:space="0"/>
-              <w:right w:val="single" w:color="BFBFBF" w:sz="4" w:space="0"/>
+              <w:top w:val="single" w:sz="4" w:space="0" w:color="BFBFBF"/>
+              <w:left w:val="single" w:sz="4" w:space="0" w:color="BFBFBF"/>
+              <w:bottom w:val="single" w:sz="4" w:space="0" w:color="BFBFBF"/>
+              <w:right w:val="single" w:sz="4" w:space="0" w:color="BFBFBF"/>
             </w:tcBorders>
-            <w:shd w:color="auto" w:fill="F2F2F2" w:val="clear"/>
+            <w:shd w:val="clear" w:color="auto" w:fill="F2F2F2"/>
             <w:tcMar>
               <w:top w:w="60" w:type="dxa"/>
               <w:left w:w="100" w:type="dxa"/>
@@ -9851,16 +9810,7 @@
                 <w:sz w:val="18"/>
                 <w:szCs w:val="18"/>
               </w:rPr>
-              <w:t>GoF</w:t>
-            </w:r>
-            <w:r>
-              <w:rPr>
-                <w:b/>
-                <w:bCs/>
-                <w:sz w:val="18"/>
-                <w:szCs w:val="18"/>
-              </w:rPr>
-              <w:t xml:space="preserve"> participants → TIVIDY classes</w:t>
+              <w:t>GoF participants → TIVIDY classes</w:t>
             </w:r>
           </w:p>
         </w:tc>
@@ -9868,10 +9818,10 @@
           <w:tcPr>
             <w:tcW w:w="7888" w:type="dxa"/>
             <w:tcBorders>
-              <w:top w:val="single" w:color="BFBFBF" w:sz="4" w:space="0"/>
-              <w:left w:val="single" w:color="BFBFBF" w:sz="4" w:space="0"/>
-              <w:bottom w:val="single" w:color="BFBFBF" w:sz="4" w:space="0"/>
-              <w:right w:val="single" w:color="BFBFBF" w:sz="4" w:space="0"/>
+              <w:top w:val="single" w:sz="4" w:space="0" w:color="BFBFBF"/>
+              <w:left w:val="single" w:sz="4" w:space="0" w:color="BFBFBF"/>
+              <w:bottom w:val="single" w:sz="4" w:space="0" w:color="BFBFBF"/>
+              <w:right w:val="single" w:sz="4" w:space="0" w:color="BFBFBF"/>
             </w:tcBorders>
             <w:tcMar>
               <w:top w:w="60" w:type="dxa"/>
@@ -9892,12 +9842,6 @@
               </w:rPr>
               <w:t>Singleton: EventDispatcher (also the Subject of Observer, 4.8)</w:t>
             </w:r>
-            <w:r>
-              <w:rPr>
-                <w:sz w:val="19"/>
-                <w:szCs w:val="19"/>
-              </w:rPr>
-            </w:r>
           </w:p>
           <w:p>
             <w:pPr>
@@ -9944,18 +9888,17 @@
       <w:tr>
         <w:trPr>
           <w:cantSplit/>
-          <w:hidden w:val="0"/>
         </w:trPr>
         <w:tc>
           <w:tcPr>
             <w:tcW w:w="1750" w:type="dxa"/>
             <w:tcBorders>
-              <w:top w:val="single" w:color="BFBFBF" w:sz="4" w:space="0"/>
-              <w:left w:val="single" w:color="BFBFBF" w:sz="4" w:space="0"/>
-              <w:bottom w:val="single" w:color="BFBFBF" w:sz="4" w:space="0"/>
-              <w:right w:val="single" w:color="BFBFBF" w:sz="4" w:space="0"/>
+              <w:top w:val="single" w:sz="4" w:space="0" w:color="BFBFBF"/>
+              <w:left w:val="single" w:sz="4" w:space="0" w:color="BFBFBF"/>
+              <w:bottom w:val="single" w:sz="4" w:space="0" w:color="BFBFBF"/>
+              <w:right w:val="single" w:sz="4" w:space="0" w:color="BFBFBF"/>
             </w:tcBorders>
-            <w:shd w:color="auto" w:fill="F2F2F2" w:val="clear"/>
+            <w:shd w:val="clear" w:color="auto" w:fill="F2F2F2"/>
             <w:tcMar>
               <w:top w:w="60" w:type="dxa"/>
               <w:left w:w="100" w:type="dxa"/>
@@ -9982,10 +9925,10 @@
           <w:tcPr>
             <w:tcW w:w="7888" w:type="dxa"/>
             <w:tcBorders>
-              <w:top w:val="single" w:color="BFBFBF" w:sz="4" w:space="0"/>
-              <w:left w:val="single" w:color="BFBFBF" w:sz="4" w:space="0"/>
-              <w:bottom w:val="single" w:color="BFBFBF" w:sz="4" w:space="0"/>
-              <w:right w:val="single" w:color="BFBFBF" w:sz="4" w:space="0"/>
+              <w:top w:val="single" w:sz="4" w:space="0" w:color="BFBFBF"/>
+              <w:left w:val="single" w:sz="4" w:space="0" w:color="BFBFBF"/>
+              <w:bottom w:val="single" w:sz="4" w:space="0" w:color="BFBFBF"/>
+              <w:right w:val="single" w:sz="4" w:space="0" w:color="BFBFBF"/>
             </w:tcBorders>
             <w:tcMar>
               <w:top w:w="60" w:type="dxa"/>
@@ -10011,18 +9954,17 @@
       <w:tr>
         <w:trPr>
           <w:cantSplit/>
-          <w:hidden w:val="0"/>
         </w:trPr>
         <w:tc>
           <w:tcPr>
             <w:tcW w:w="1750" w:type="dxa"/>
             <w:tcBorders>
-              <w:top w:val="single" w:color="BFBFBF" w:sz="4" w:space="0"/>
-              <w:left w:val="single" w:color="BFBFBF" w:sz="4" w:space="0"/>
-              <w:bottom w:val="single" w:color="BFBFBF" w:sz="4" w:space="0"/>
-              <w:right w:val="single" w:color="BFBFBF" w:sz="4" w:space="0"/>
+              <w:top w:val="single" w:sz="4" w:space="0" w:color="BFBFBF"/>
+              <w:left w:val="single" w:sz="4" w:space="0" w:color="BFBFBF"/>
+              <w:bottom w:val="single" w:sz="4" w:space="0" w:color="BFBFBF"/>
+              <w:right w:val="single" w:sz="4" w:space="0" w:color="BFBFBF"/>
             </w:tcBorders>
-            <w:shd w:color="auto" w:fill="F2F2F2" w:val="clear"/>
+            <w:shd w:val="clear" w:color="auto" w:fill="F2F2F2"/>
             <w:tcMar>
               <w:top w:w="60" w:type="dxa"/>
               <w:left w:w="100" w:type="dxa"/>
@@ -10049,10 +9991,10 @@
           <w:tcPr>
             <w:tcW w:w="7888" w:type="dxa"/>
             <w:tcBorders>
-              <w:top w:val="single" w:color="BFBFBF" w:sz="4" w:space="0"/>
-              <w:left w:val="single" w:color="BFBFBF" w:sz="4" w:space="0"/>
-              <w:bottom w:val="single" w:color="BFBFBF" w:sz="4" w:space="0"/>
-              <w:right w:val="single" w:color="BFBFBF" w:sz="4" w:space="0"/>
+              <w:top w:val="single" w:sz="4" w:space="0" w:color="BFBFBF"/>
+              <w:left w:val="single" w:sz="4" w:space="0" w:color="BFBFBF"/>
+              <w:bottom w:val="single" w:sz="4" w:space="0" w:color="BFBFBF"/>
+              <w:right w:val="single" w:sz="4" w:space="0" w:color="BFBFBF"/>
             </w:tcBorders>
             <w:tcMar>
               <w:top w:w="60" w:type="dxa"/>
@@ -10078,18 +10020,17 @@
       <w:tr>
         <w:trPr>
           <w:cantSplit/>
-          <w:hidden w:val="0"/>
         </w:trPr>
         <w:tc>
           <w:tcPr>
             <w:tcW w:w="1750" w:type="dxa"/>
             <w:tcBorders>
-              <w:top w:val="single" w:color="BFBFBF" w:sz="4" w:space="0"/>
-              <w:left w:val="single" w:color="BFBFBF" w:sz="4" w:space="0"/>
-              <w:bottom w:val="single" w:color="BFBFBF" w:sz="4" w:space="0"/>
-              <w:right w:val="single" w:color="BFBFBF" w:sz="4" w:space="0"/>
+              <w:top w:val="single" w:sz="4" w:space="0" w:color="BFBFBF"/>
+              <w:left w:val="single" w:sz="4" w:space="0" w:color="BFBFBF"/>
+              <w:bottom w:val="single" w:sz="4" w:space="0" w:color="BFBFBF"/>
+              <w:right w:val="single" w:sz="4" w:space="0" w:color="BFBFBF"/>
             </w:tcBorders>
-            <w:shd w:color="auto" w:fill="F2F2F2" w:val="clear"/>
+            <w:shd w:val="clear" w:color="auto" w:fill="F2F2F2"/>
             <w:tcMar>
               <w:top w:w="60" w:type="dxa"/>
               <w:left w:w="100" w:type="dxa"/>
@@ -10116,10 +10057,10 @@
           <w:tcPr>
             <w:tcW w:w="7888" w:type="dxa"/>
             <w:tcBorders>
-              <w:top w:val="single" w:color="BFBFBF" w:sz="4" w:space="0"/>
-              <w:left w:val="single" w:color="BFBFBF" w:sz="4" w:space="0"/>
-              <w:bottom w:val="single" w:color="BFBFBF" w:sz="4" w:space="0"/>
-              <w:right w:val="single" w:color="BFBFBF" w:sz="4" w:space="0"/>
+              <w:top w:val="single" w:sz="4" w:space="0" w:color="BFBFBF"/>
+              <w:left w:val="single" w:sz="4" w:space="0" w:color="BFBFBF"/>
+              <w:bottom w:val="single" w:sz="4" w:space="0" w:color="BFBFBF"/>
+              <w:right w:val="single" w:sz="4" w:space="0" w:color="BFBFBF"/>
             </w:tcBorders>
             <w:tcMar>
               <w:top w:w="60" w:type="dxa"/>
@@ -10145,18 +10086,17 @@
       <w:tr>
         <w:trPr>
           <w:cantSplit/>
-          <w:hidden w:val="0"/>
         </w:trPr>
         <w:tc>
           <w:tcPr>
             <w:tcW w:w="1750" w:type="dxa"/>
             <w:tcBorders>
-              <w:top w:val="single" w:color="BFBFBF" w:sz="4" w:space="0"/>
-              <w:left w:val="single" w:color="BFBFBF" w:sz="4" w:space="0"/>
-              <w:bottom w:val="single" w:color="BFBFBF" w:sz="4" w:space="0"/>
-              <w:right w:val="single" w:color="BFBFBF" w:sz="4" w:space="0"/>
+              <w:top w:val="single" w:sz="4" w:space="0" w:color="BFBFBF"/>
+              <w:left w:val="single" w:sz="4" w:space="0" w:color="BFBFBF"/>
+              <w:bottom w:val="single" w:sz="4" w:space="0" w:color="BFBFBF"/>
+              <w:right w:val="single" w:sz="4" w:space="0" w:color="BFBFBF"/>
             </w:tcBorders>
-            <w:shd w:color="auto" w:fill="F2F2F2" w:val="clear"/>
+            <w:shd w:val="clear" w:color="auto" w:fill="F2F2F2"/>
             <w:tcMar>
               <w:top w:w="60" w:type="dxa"/>
               <w:left w:w="100" w:type="dxa"/>
@@ -10182,10 +10122,10 @@
           <w:tcPr>
             <w:tcW w:w="7888" w:type="dxa"/>
             <w:tcBorders>
-              <w:top w:val="single" w:color="BFBFBF" w:sz="4" w:space="0"/>
-              <w:left w:val="single" w:color="BFBFBF" w:sz="4" w:space="0"/>
-              <w:bottom w:val="single" w:color="BFBFBF" w:sz="4" w:space="0"/>
-              <w:right w:val="single" w:color="BFBFBF" w:sz="4" w:space="0"/>
+              <w:top w:val="single" w:sz="4" w:space="0" w:color="BFBFBF"/>
+              <w:left w:val="single" w:sz="4" w:space="0" w:color="BFBFBF"/>
+              <w:bottom w:val="single" w:sz="4" w:space="0" w:color="BFBFBF"/>
+              <w:right w:val="single" w:sz="4" w:space="0" w:color="BFBFBF"/>
             </w:tcBorders>
             <w:tcMar>
               <w:top w:w="60" w:type="dxa"/>
@@ -10214,12 +10154,9 @@
         <w:pStyle w:val="Heading2"/>
         <w:keepNext/>
       </w:pPr>
-      <w:proofErr w:type="gramStart"/>
       <w:r>
         <w:t>4.14  How the patterns form one system</w:t>
       </w:r>
-      <w:proofErr w:type="gramEnd"/>
-      <w:r/>
     </w:p>
     <w:p>
       <w:pPr>
@@ -10236,12 +10173,11 @@
     <w:p>
       <w:pPr>
         <w:pStyle w:val="Heading1"/>
+        <w:keepNext/>
         <w:pageBreakBefore/>
-        <w:keepNext/>
       </w:pPr>
       <w:r>
-        <w:rPr/>
-        <w:t xml:space="preserve">Task 5: UML Class Diagram</w:t>
+        <w:t>Task 5: UML Class Diagram</w:t>
       </w:r>
     </w:p>
     <w:p>
@@ -10270,7 +10206,7 @@
                         <pic:cNvPicPr/>
                       </pic:nvPicPr>
                       <pic:blipFill rotWithShape="1">
-                        <a:blip r:embed="rId13"/>
+                        <a:blip r:embed="rId23"/>
                         <a:srcRect/>
                         <a:stretch/>
                       </pic:blipFill>
@@ -10322,8 +10258,8 @@
     </w:p>
     <w:p>
       <w:pPr>
+        <w:spacing w:before="60" w:after="240"/>
         <w:jc w:val="center"/>
-        <w:spacing w:before="60" w:after="240"/>
       </w:pPr>
       <w:r>
         <w:rPr>
@@ -10332,18 +10268,17 @@
           <w:sz w:val="18"/>
           <w:szCs w:val="18"/>
         </w:rPr>
-        <w:t xml:space="preserve">UML Class Diagram: colours mark the pattern collaborations (see legend)</w:t>
+        <w:t>UML Class Diagram: colours mark the pattern collaborations (see legend)</w:t>
       </w:r>
     </w:p>
     <w:p>
       <w:pPr>
         <w:pStyle w:val="Heading1"/>
+        <w:keepNext/>
         <w:pageBreakBefore/>
-        <w:keepNext/>
       </w:pPr>
       <w:r>
-        <w:rPr/>
-        <w:t xml:space="preserve">Task 6: Runtime Behaviour Diagrams</w:t>
+        <w:t>Task 6: Runtime Behaviour Diagrams</w:t>
       </w:r>
     </w:p>
     <w:p>
@@ -10352,8 +10287,7 @@
         <w:keepNext/>
       </w:pPr>
       <w:r>
-        <w:rPr/>
-        <w:t xml:space="preserve">6.1  UML Sequence Diagrams</w:t>
+        <w:t>6.1  UML Sequence Diagrams</w:t>
       </w:r>
     </w:p>
     <w:p>
@@ -10387,7 +10321,7 @@
                         </pic:cNvPicPr>
                       </pic:nvPicPr>
                       <pic:blipFill rotWithShape="1">
-                        <a:blip r:embed="rId25"/>
+                        <a:blip r:embed="rId24"/>
                         <a:stretch/>
                       </pic:blipFill>
                       <pic:spPr bwMode="auto">
@@ -10437,8 +10371,8 @@
     </w:p>
     <w:p>
       <w:pPr>
+        <w:spacing w:before="60" w:after="240"/>
         <w:jc w:val="center"/>
-        <w:spacing w:before="60" w:after="240"/>
       </w:pPr>
       <w:r>
         <w:rPr>
@@ -10447,7 +10381,7 @@
           <w:sz w:val="18"/>
           <w:szCs w:val="18"/>
         </w:rPr>
-        <w:t xml:space="preserve">Sequence Diagram 1: Creating and starting a workflow instance</w:t>
+        <w:t>Sequence Diagram 1: Creating and starting a workflow instance</w:t>
       </w:r>
     </w:p>
     <w:p>
@@ -10531,8 +10465,8 @@
     </w:p>
     <w:p>
       <w:pPr>
+        <w:spacing w:before="60" w:after="240"/>
         <w:jc w:val="center"/>
-        <w:spacing w:before="60" w:after="240"/>
       </w:pPr>
       <w:r>
         <w:rPr>
@@ -10541,7 +10475,7 @@
           <w:sz w:val="18"/>
           <w:szCs w:val="18"/>
         </w:rPr>
-        <w:t xml:space="preserve">Sequence Diagram 2: Completing a review task and notifying listeners</w:t>
+        <w:t>Sequence Diagram 2: Completing a review task and notifying listeners</w:t>
       </w:r>
     </w:p>
     <w:p>
@@ -10550,8 +10484,7 @@
         <w:keepNext/>
       </w:pPr>
       <w:r>
-        <w:rPr/>
-        <w:t xml:space="preserve">6.2  UML State Diagram</w:t>
+        <w:t>6.2  UML State Diagram</w:t>
       </w:r>
     </w:p>
     <w:p>
@@ -10585,7 +10518,7 @@
                         </pic:cNvPicPr>
                       </pic:nvPicPr>
                       <pic:blipFill rotWithShape="1">
-                        <a:blip r:embed="rId23"/>
+                        <a:blip r:embed="rId29"/>
                         <a:stretch/>
                       </pic:blipFill>
                       <pic:spPr bwMode="auto">
@@ -10625,7 +10558,7 @@
                 <o:lock v:ext="edit" aspectratio="t"/>
               </v:shapetype>
               <v:shape id="_x0000_i4" o:spid="_x0000_s4" type="#_x0000_t75" style="width:441.00pt;height:618.00pt;mso-wrap-distance-left:0.00pt;mso-wrap-distance-top:0.00pt;mso-wrap-distance-right:0.00pt;mso-wrap-distance-bottom:0.00pt;z-index:1;" stroked="false">
-                <v:imagedata r:id="rId24" o:title=""/>
+                <v:imagedata r:id="rId30" o:title=""/>
                 <o:lock v:ext="edit" rotation="t"/>
               </v:shape>
             </w:pict>
@@ -10635,8 +10568,8 @@
     </w:p>
     <w:p>
       <w:pPr>
+        <w:spacing w:before="60" w:after="240"/>
         <w:jc w:val="center"/>
-        <w:spacing w:before="60" w:after="240"/>
       </w:pPr>
       <w:r>
         <w:rPr>
@@ -10645,25 +10578,24 @@
           <w:sz w:val="18"/>
           <w:szCs w:val="18"/>
         </w:rPr>
-        <w:t xml:space="preserve">State Diagram: lifecycle of a running object</w:t>
+        <w:t>State Diagram: lifecycle of a running object</w:t>
       </w:r>
     </w:p>
     <w:p>
       <w:pPr>
         <w:pStyle w:val="Heading1"/>
+        <w:keepNext/>
         <w:pageBreakBefore/>
-        <w:keepNext/>
       </w:pPr>
       <w:r>
-        <w:rPr/>
-        <w:t xml:space="preserve">GitHub Repository</w:t>
+        <w:t>GitHub Repository</w:t>
       </w:r>
     </w:p>
     <w:p>
       <w:pPr>
         <w:spacing w:after="100" w:line="252" w:lineRule="auto"/>
       </w:pPr>
-      <w:hyperlink r:id="rId29" w:tooltip="https://github.com/patrickkaleo/COS214_P6" w:history="1">
+      <w:hyperlink r:id="rId31" w:tooltip="https://github.com/patrickkaleo/COS214_P6" w:history="1">
         <w:r>
           <w:rPr>
             <w:rStyle w:val="Hyperlink"/>
@@ -10678,17 +10610,16 @@
         <w:keepNext/>
       </w:pPr>
       <w:r>
-        <w:rPr/>
-        <w:t xml:space="preserve">Team Contribution Statement</w:t>
+        <w:t>Team Contribution Statement</w:t>
       </w:r>
     </w:p>
     <w:p>
       <w:pPr>
+        <w:spacing w:before="120" w:after="20" w:line="252" w:lineRule="auto"/>
         <w:rPr>
           <w:sz w:val="19"/>
           <w:szCs w:val="19"/>
         </w:rPr>
-        <w:spacing w:before="120" w:after="20" w:line="252" w:lineRule="auto"/>
       </w:pPr>
       <w:r>
         <w:rPr>
@@ -10701,11 +10632,11 @@
     </w:p>
     <w:p>
       <w:pPr>
+        <w:spacing w:after="100" w:line="252" w:lineRule="auto"/>
         <w:rPr>
           <w:sz w:val="19"/>
           <w:szCs w:val="19"/>
         </w:rPr>
-        <w:spacing w:after="100" w:line="252" w:lineRule="auto"/>
       </w:pPr>
       <w:r>
         <w:rPr>
@@ -10717,11 +10648,11 @@
     </w:p>
     <w:p>
       <w:pPr>
+        <w:spacing w:before="120" w:after="20" w:line="252" w:lineRule="auto"/>
         <w:rPr>
           <w:sz w:val="19"/>
           <w:szCs w:val="19"/>
         </w:rPr>
-        <w:spacing w:before="120" w:after="20" w:line="252" w:lineRule="auto"/>
       </w:pPr>
       <w:r>
         <w:rPr>
@@ -10734,11 +10665,11 @@
     </w:p>
     <w:p>
       <w:pPr>
+        <w:spacing w:after="100" w:line="252" w:lineRule="auto"/>
         <w:rPr>
           <w:sz w:val="19"/>
           <w:szCs w:val="19"/>
         </w:rPr>
-        <w:spacing w:after="100" w:line="252" w:lineRule="auto"/>
       </w:pPr>
       <w:r>
         <w:rPr>
@@ -10766,11 +10697,11 @@
     </w:p>
     <w:p>
       <w:pPr>
+        <w:spacing w:before="120" w:after="20" w:line="252" w:lineRule="auto"/>
         <w:rPr>
           <w:sz w:val="19"/>
           <w:szCs w:val="19"/>
         </w:rPr>
-        <w:spacing w:before="120" w:after="20" w:line="252" w:lineRule="auto"/>
       </w:pPr>
       <w:r>
         <w:rPr>
@@ -10783,11 +10714,11 @@
     </w:p>
     <w:p>
       <w:pPr>
+        <w:spacing w:after="100" w:line="252" w:lineRule="auto"/>
         <w:rPr>
           <w:sz w:val="19"/>
           <w:szCs w:val="19"/>
         </w:rPr>
-        <w:spacing w:after="100" w:line="252" w:lineRule="auto"/>
       </w:pPr>
       <w:r>
         <w:rPr>
@@ -10799,11 +10730,11 @@
     </w:p>
     <w:p>
       <w:pPr>
+        <w:spacing w:before="120" w:after="20" w:line="252" w:lineRule="auto"/>
         <w:rPr>
           <w:sz w:val="19"/>
           <w:szCs w:val="19"/>
         </w:rPr>
-        <w:spacing w:before="120" w:after="20" w:line="252" w:lineRule="auto"/>
       </w:pPr>
       <w:r>
         <w:rPr>
@@ -10819,11 +10750,11 @@
         <w:tabs>
           <w:tab w:val="left" w:pos="2768"/>
         </w:tabs>
+        <w:spacing w:after="100" w:line="252" w:lineRule="auto"/>
         <w:rPr>
           <w:sz w:val="19"/>
           <w:szCs w:val="19"/>
         </w:rPr>
-        <w:spacing w:after="100" w:line="252" w:lineRule="auto"/>
       </w:pPr>
       <w:r>
         <w:rPr>
@@ -10856,11 +10787,11 @@
     </w:p>
     <w:p>
       <w:pPr>
+        <w:spacing w:before="120" w:after="20" w:line="252" w:lineRule="auto"/>
         <w:rPr>
           <w:sz w:val="19"/>
           <w:szCs w:val="19"/>
         </w:rPr>
-        <w:spacing w:before="120" w:after="20" w:line="252" w:lineRule="auto"/>
       </w:pPr>
       <w:r>
         <w:rPr>
@@ -10873,11 +10804,11 @@
     </w:p>
     <w:p>
       <w:pPr>
+        <w:spacing w:after="100" w:line="252" w:lineRule="auto"/>
         <w:rPr>
           <w:sz w:val="19"/>
           <w:szCs w:val="19"/>
         </w:rPr>
-        <w:spacing w:after="100" w:line="252" w:lineRule="auto"/>
       </w:pPr>
       <w:r>
         <w:rPr>
@@ -10889,11 +10820,11 @@
     </w:p>
     <w:p>
       <w:pPr>
+        <w:spacing w:before="120" w:after="20" w:line="252" w:lineRule="auto"/>
         <w:rPr>
           <w:sz w:val="19"/>
           <w:szCs w:val="19"/>
         </w:rPr>
-        <w:spacing w:before="120" w:after="20" w:line="252" w:lineRule="auto"/>
       </w:pPr>
       <w:r>
         <w:rPr>
@@ -10924,11 +10855,11 @@
     </w:p>
     <w:p>
       <w:pPr>
+        <w:spacing w:after="100" w:line="252" w:lineRule="auto"/>
         <w:rPr>
           <w:sz w:val="19"/>
           <w:szCs w:val="19"/>
         </w:rPr>
-        <w:spacing w:after="100" w:line="252" w:lineRule="auto"/>
       </w:pPr>
       <w:r>
         <w:rPr>
@@ -10940,11 +10871,11 @@
     </w:p>
     <w:p>
       <w:pPr>
+        <w:spacing w:before="120" w:after="20" w:line="252" w:lineRule="auto"/>
         <w:rPr>
           <w:sz w:val="19"/>
           <w:szCs w:val="19"/>
         </w:rPr>
-        <w:spacing w:before="120" w:after="20" w:line="252" w:lineRule="auto"/>
       </w:pPr>
       <w:r>
         <w:rPr>
@@ -10957,36 +10888,22 @@
     </w:p>
     <w:p>
       <w:pPr>
+        <w:spacing w:after="100" w:line="252" w:lineRule="auto"/>
         <w:rPr>
           <w:sz w:val="19"/>
           <w:szCs w:val="19"/>
         </w:rPr>
-        <w:spacing w:after="100" w:line="252" w:lineRule="auto"/>
       </w:pPr>
       <w:r>
         <w:rPr>
           <w:sz w:val="19"/>
           <w:szCs w:val="19"/>
         </w:rPr>
-        <w:t>Worked on sequence diagram</w:t>
-      </w:r>
-      <w:r>
-        <w:rPr>
-          <w:sz w:val="19"/>
-          <w:szCs w:val="19"/>
-        </w:rPr>
-        <w:t xml:space="preserve"> </w:t>
-      </w:r>
-      <w:r>
-        <w:rPr>
-          <w:sz w:val="19"/>
-          <w:szCs w:val="19"/>
-        </w:rPr>
-        <w:t>2.</w:t>
+        <w:t>Worked on sequence diagram 2.</w:t>
       </w:r>
     </w:p>
     <w:sectPr>
-      <w:footerReference w:type="default" r:id="rId30"/>
+      <w:footerReference w:type="default" r:id="rId32"/>
       <w:pgSz w:w="11906" w:h="16838"/>
       <w:pgMar w:top="1134" w:right="1134" w:bottom="1134" w:left="1134" w:header="708" w:footer="708" w:gutter="0"/>
       <w:cols w:space="1701"/>

</xml_diff>